<commit_message>
Update the CV and Resume
</commit_message>
<xml_diff>
--- a/docs/Omid Reza Heidari-Resume.docx
+++ b/docs/Omid Reza Heidari-Resume.docx
@@ -561,7 +561,6 @@
         <w:t xml:space="preserve"> </w:t>
       </w:r>
       <w:hyperlink r:id="rId13" w:history="1">
-        <w:proofErr w:type="spellStart"/>
         <w:r>
           <w:rPr>
             <w:rStyle w:val="Hyperlink"/>
@@ -574,7 +573,6 @@
           </w:rPr>
           <w:t>Coffake</w:t>
         </w:r>
-        <w:proofErr w:type="spellEnd"/>
       </w:hyperlink>
     </w:p>
     <w:p>
@@ -774,7 +772,6 @@
         <w:t xml:space="preserve"> </w:t>
       </w:r>
       <w:hyperlink r:id="rId14" w:history="1">
-        <w:proofErr w:type="spellStart"/>
         <w:r>
           <w:rPr>
             <w:rStyle w:val="Hyperlink"/>
@@ -785,9 +782,32 @@
             <w:u w:val="none"/>
             <w:lang w:bidi="fa-IR"/>
           </w:rPr>
-          <w:t>Cansell</w:t>
+          <w:t>Can</w:t>
         </w:r>
-        <w:proofErr w:type="spellEnd"/>
+        <w:r>
+          <w:rPr>
+            <w:rStyle w:val="Hyperlink"/>
+            <w:rFonts w:asciiTheme="minorBidi" w:hAnsiTheme="minorBidi"/>
+            <w:color w:val="2F5496" w:themeColor="accent1" w:themeShade="BF"/>
+            <w:sz w:val="20"/>
+            <w:szCs w:val="20"/>
+            <w:u w:val="none"/>
+            <w:lang w:bidi="fa-IR"/>
+          </w:rPr>
+          <w:t>S</w:t>
+        </w:r>
+        <w:r>
+          <w:rPr>
+            <w:rStyle w:val="Hyperlink"/>
+            <w:rFonts w:asciiTheme="minorBidi" w:hAnsiTheme="minorBidi"/>
+            <w:color w:val="2F5496" w:themeColor="accent1" w:themeShade="BF"/>
+            <w:sz w:val="20"/>
+            <w:szCs w:val="20"/>
+            <w:u w:val="none"/>
+            <w:lang w:bidi="fa-IR"/>
+          </w:rPr>
+          <w:t>ell</w:t>
+        </w:r>
       </w:hyperlink>
     </w:p>
     <w:p>
@@ -813,154 +833,27 @@
           <w:szCs w:val="20"/>
           <w:lang w:bidi="fa-IR"/>
         </w:rPr>
-        <w:t>Participated in API developing and ameliorating some web pages</w:t>
-      </w:r>
-    </w:p>
-    <w:p>
-      <w:pPr>
-        <w:rPr>
-          <w:rFonts w:asciiTheme="minorBidi" w:hAnsiTheme="minorBidi"/>
-          <w:color w:val="4C4D4F"/>
-          <w:sz w:val="20"/>
-          <w:szCs w:val="20"/>
-          <w:lang w:bidi="fa-IR"/>
-        </w:rPr>
-      </w:pPr>
-      <w:r>
-        <w:rPr>
-          <w:rFonts w:asciiTheme="minorBidi" w:hAnsiTheme="minorBidi"/>
-          <w:color w:val="4C4D4F"/>
-          <w:sz w:val="20"/>
-          <w:szCs w:val="20"/>
-          <w:lang w:bidi="fa-IR"/>
-        </w:rPr>
-        <w:t>Oct</w:t>
-      </w:r>
-      <w:r>
-        <w:rPr>
-          <w:rFonts w:asciiTheme="minorBidi" w:hAnsiTheme="minorBidi"/>
-          <w:color w:val="4C4D4F"/>
-          <w:sz w:val="20"/>
-          <w:szCs w:val="20"/>
-          <w:lang w:bidi="fa-IR"/>
-        </w:rPr>
-        <w:t xml:space="preserve"> 20</w:t>
-      </w:r>
-      <w:r>
-        <w:rPr>
-          <w:rFonts w:asciiTheme="minorBidi" w:hAnsiTheme="minorBidi"/>
-          <w:color w:val="4C4D4F"/>
-          <w:sz w:val="20"/>
-          <w:szCs w:val="20"/>
-          <w:lang w:bidi="fa-IR"/>
-        </w:rPr>
-        <w:t>19</w:t>
-      </w:r>
-      <w:r>
-        <w:rPr>
-          <w:rFonts w:asciiTheme="minorBidi" w:hAnsiTheme="minorBidi"/>
-          <w:color w:val="4C4D4F"/>
-          <w:sz w:val="20"/>
-          <w:szCs w:val="20"/>
-          <w:lang w:bidi="fa-IR"/>
-        </w:rPr>
-        <w:t xml:space="preserve"> - </w:t>
-      </w:r>
-      <w:r>
-        <w:rPr>
-          <w:rFonts w:asciiTheme="minorBidi" w:hAnsiTheme="minorBidi"/>
-          <w:color w:val="4C4D4F"/>
-          <w:sz w:val="20"/>
-          <w:szCs w:val="20"/>
-          <w:lang w:bidi="fa-IR"/>
-        </w:rPr>
-        <w:t>Nov</w:t>
-      </w:r>
-      <w:r>
-        <w:rPr>
-          <w:rFonts w:asciiTheme="minorBidi" w:hAnsiTheme="minorBidi"/>
-          <w:color w:val="4C4D4F"/>
-          <w:sz w:val="20"/>
-          <w:szCs w:val="20"/>
-          <w:lang w:bidi="fa-IR"/>
-        </w:rPr>
-        <w:t xml:space="preserve"> 20</w:t>
-      </w:r>
-      <w:r>
-        <w:rPr>
-          <w:rFonts w:asciiTheme="minorBidi" w:hAnsiTheme="minorBidi"/>
-          <w:color w:val="4C4D4F"/>
-          <w:sz w:val="20"/>
-          <w:szCs w:val="20"/>
-          <w:lang w:bidi="fa-IR"/>
-        </w:rPr>
-        <w:t>19</w:t>
-      </w:r>
-      <w:r>
-        <w:rPr>
-          <w:rFonts w:asciiTheme="minorBidi" w:hAnsiTheme="minorBidi"/>
-          <w:color w:val="4C4D4F"/>
-          <w:sz w:val="20"/>
-          <w:szCs w:val="20"/>
-          <w:lang w:bidi="fa-IR"/>
-        </w:rPr>
-        <w:tab/>
-      </w:r>
-      <w:r>
-        <w:rPr>
-          <w:rFonts w:asciiTheme="minorBidi" w:hAnsiTheme="minorBidi"/>
-          <w:b/>
-          <w:bCs/>
-          <w:color w:val="4C4D4F"/>
-          <w:sz w:val="20"/>
-          <w:szCs w:val="20"/>
-          <w:lang w:bidi="fa-IR"/>
-        </w:rPr>
-        <w:t>Back-end</w:t>
-      </w:r>
-      <w:r>
-        <w:rPr>
-          <w:rFonts w:asciiTheme="minorBidi" w:hAnsiTheme="minorBidi"/>
-          <w:color w:val="4C4D4F"/>
-          <w:sz w:val="20"/>
-          <w:szCs w:val="20"/>
-          <w:lang w:bidi="fa-IR"/>
-        </w:rPr>
-        <w:t xml:space="preserve"> </w:t>
-      </w:r>
-      <w:r>
-        <w:rPr>
-          <w:rFonts w:asciiTheme="minorBidi" w:hAnsiTheme="minorBidi"/>
-          <w:b/>
-          <w:bCs/>
-          <w:color w:val="4C4D4F"/>
-          <w:sz w:val="20"/>
-          <w:szCs w:val="20"/>
-          <w:lang w:bidi="fa-IR"/>
-        </w:rPr>
-        <w:t>Developer</w:t>
-      </w:r>
-      <w:r>
-        <w:rPr>
-          <w:rFonts w:asciiTheme="minorBidi" w:hAnsiTheme="minorBidi"/>
-          <w:b/>
-          <w:bCs/>
-          <w:color w:val="4C4D4F"/>
-          <w:sz w:val="20"/>
-          <w:szCs w:val="20"/>
-          <w:lang w:bidi="fa-IR"/>
-        </w:rPr>
-        <w:t xml:space="preserve">, </w:t>
-      </w:r>
-      <w:r>
-        <w:rPr>
-          <w:rFonts w:asciiTheme="minorBidi" w:hAnsiTheme="minorBidi"/>
-          <w:color w:val="4C4D4F"/>
-          <w:sz w:val="20"/>
-          <w:szCs w:val="20"/>
-          <w:lang w:bidi="fa-IR"/>
-        </w:rPr>
-        <w:t>Onlinegnet</w:t>
+        <w:t>Adding a new feature called book purchas</w:t>
+      </w:r>
+      <w:r>
+        <w:rPr>
+          <w:rFonts w:asciiTheme="minorBidi" w:hAnsiTheme="minorBidi"/>
+          <w:color w:val="4C4D4F"/>
+          <w:sz w:val="20"/>
+          <w:szCs w:val="20"/>
+          <w:lang w:bidi="fa-IR"/>
+        </w:rPr>
+        <w:t>ing</w:t>
+      </w:r>
+      <w:r>
+        <w:rPr>
+          <w:rFonts w:asciiTheme="minorBidi" w:hAnsiTheme="minorBidi"/>
+          <w:color w:val="4C4D4F"/>
+          <w:sz w:val="20"/>
+          <w:szCs w:val="20"/>
+          <w:lang w:bidi="fa-IR"/>
+        </w:rPr>
+        <w:t>, which allows users to buy books online</w:t>
       </w:r>
     </w:p>
     <w:p>
@@ -986,17 +879,369 @@
           <w:szCs w:val="20"/>
           <w:lang w:bidi="fa-IR"/>
         </w:rPr>
-        <w:t xml:space="preserve">Participated in API developing </w:t>
-      </w:r>
-      <w:r>
-        <w:rPr>
-          <w:rFonts w:asciiTheme="minorBidi" w:hAnsiTheme="minorBidi"/>
-          <w:color w:val="4C4D4F"/>
-          <w:sz w:val="20"/>
-          <w:szCs w:val="20"/>
-          <w:lang w:bidi="fa-IR"/>
-        </w:rPr>
-        <w:t>and adding several new features, such as renting a game</w:t>
+        <w:t>Setup a payment gateway and connect it to the API</w:t>
+      </w:r>
+    </w:p>
+    <w:p>
+      <w:pPr>
+        <w:pStyle w:val="ListParagraph"/>
+        <w:numPr>
+          <w:ilvl w:val="0"/>
+          <w:numId w:val="1"/>
+        </w:numPr>
+        <w:rPr>
+          <w:rFonts w:asciiTheme="minorBidi" w:hAnsiTheme="minorBidi"/>
+          <w:color w:val="4C4D4F"/>
+          <w:sz w:val="20"/>
+          <w:szCs w:val="20"/>
+          <w:lang w:bidi="fa-IR"/>
+        </w:rPr>
+      </w:pPr>
+      <w:r>
+        <w:rPr>
+          <w:rFonts w:asciiTheme="minorBidi" w:hAnsiTheme="minorBidi"/>
+          <w:color w:val="4C4D4F"/>
+          <w:sz w:val="20"/>
+          <w:szCs w:val="20"/>
+          <w:lang w:bidi="fa-IR"/>
+        </w:rPr>
+        <w:t>Refactoring database migrations to have a more efficient database</w:t>
+      </w:r>
+    </w:p>
+    <w:p>
+      <w:pPr>
+        <w:rPr>
+          <w:rFonts w:asciiTheme="minorBidi" w:hAnsiTheme="minorBidi"/>
+          <w:color w:val="4C4D4F"/>
+          <w:sz w:val="20"/>
+          <w:szCs w:val="20"/>
+          <w:lang w:bidi="fa-IR"/>
+        </w:rPr>
+      </w:pPr>
+      <w:r>
+        <w:rPr>
+          <w:rFonts w:asciiTheme="minorBidi" w:hAnsiTheme="minorBidi"/>
+          <w:color w:val="4C4D4F"/>
+          <w:sz w:val="20"/>
+          <w:szCs w:val="20"/>
+          <w:lang w:bidi="fa-IR"/>
+        </w:rPr>
+        <w:t>Oct</w:t>
+      </w:r>
+      <w:r>
+        <w:rPr>
+          <w:rFonts w:asciiTheme="minorBidi" w:hAnsiTheme="minorBidi"/>
+          <w:color w:val="4C4D4F"/>
+          <w:sz w:val="20"/>
+          <w:szCs w:val="20"/>
+          <w:lang w:bidi="fa-IR"/>
+        </w:rPr>
+        <w:t xml:space="preserve"> 20</w:t>
+      </w:r>
+      <w:r>
+        <w:rPr>
+          <w:rFonts w:asciiTheme="minorBidi" w:hAnsiTheme="minorBidi"/>
+          <w:color w:val="4C4D4F"/>
+          <w:sz w:val="20"/>
+          <w:szCs w:val="20"/>
+          <w:lang w:bidi="fa-IR"/>
+        </w:rPr>
+        <w:t>19</w:t>
+      </w:r>
+      <w:r>
+        <w:rPr>
+          <w:rFonts w:asciiTheme="minorBidi" w:hAnsiTheme="minorBidi"/>
+          <w:color w:val="4C4D4F"/>
+          <w:sz w:val="20"/>
+          <w:szCs w:val="20"/>
+          <w:lang w:bidi="fa-IR"/>
+        </w:rPr>
+        <w:t xml:space="preserve"> - </w:t>
+      </w:r>
+      <w:r>
+        <w:rPr>
+          <w:rFonts w:asciiTheme="minorBidi" w:hAnsiTheme="minorBidi"/>
+          <w:color w:val="4C4D4F"/>
+          <w:sz w:val="20"/>
+          <w:szCs w:val="20"/>
+          <w:lang w:bidi="fa-IR"/>
+        </w:rPr>
+        <w:t>Nov</w:t>
+      </w:r>
+      <w:r>
+        <w:rPr>
+          <w:rFonts w:asciiTheme="minorBidi" w:hAnsiTheme="minorBidi"/>
+          <w:color w:val="4C4D4F"/>
+          <w:sz w:val="20"/>
+          <w:szCs w:val="20"/>
+          <w:lang w:bidi="fa-IR"/>
+        </w:rPr>
+        <w:t xml:space="preserve"> 20</w:t>
+      </w:r>
+      <w:r>
+        <w:rPr>
+          <w:rFonts w:asciiTheme="minorBidi" w:hAnsiTheme="minorBidi"/>
+          <w:color w:val="4C4D4F"/>
+          <w:sz w:val="20"/>
+          <w:szCs w:val="20"/>
+          <w:lang w:bidi="fa-IR"/>
+        </w:rPr>
+        <w:t>19</w:t>
+      </w:r>
+      <w:r>
+        <w:rPr>
+          <w:rFonts w:asciiTheme="minorBidi" w:hAnsiTheme="minorBidi"/>
+          <w:color w:val="4C4D4F"/>
+          <w:sz w:val="20"/>
+          <w:szCs w:val="20"/>
+          <w:lang w:bidi="fa-IR"/>
+        </w:rPr>
+        <w:tab/>
+      </w:r>
+      <w:r>
+        <w:rPr>
+          <w:rFonts w:asciiTheme="minorBidi" w:hAnsiTheme="minorBidi"/>
+          <w:b/>
+          <w:bCs/>
+          <w:color w:val="4C4D4F"/>
+          <w:sz w:val="20"/>
+          <w:szCs w:val="20"/>
+          <w:lang w:bidi="fa-IR"/>
+        </w:rPr>
+        <w:t>Back-end</w:t>
+      </w:r>
+      <w:r>
+        <w:rPr>
+          <w:rFonts w:asciiTheme="minorBidi" w:hAnsiTheme="minorBidi"/>
+          <w:color w:val="4C4D4F"/>
+          <w:sz w:val="20"/>
+          <w:szCs w:val="20"/>
+          <w:lang w:bidi="fa-IR"/>
+        </w:rPr>
+        <w:t xml:space="preserve"> </w:t>
+      </w:r>
+      <w:r>
+        <w:rPr>
+          <w:rFonts w:asciiTheme="minorBidi" w:hAnsiTheme="minorBidi"/>
+          <w:b/>
+          <w:bCs/>
+          <w:color w:val="4C4D4F"/>
+          <w:sz w:val="20"/>
+          <w:szCs w:val="20"/>
+          <w:lang w:bidi="fa-IR"/>
+        </w:rPr>
+        <w:t>Developer</w:t>
+      </w:r>
+      <w:r>
+        <w:rPr>
+          <w:rFonts w:asciiTheme="minorBidi" w:hAnsiTheme="minorBidi"/>
+          <w:b/>
+          <w:bCs/>
+          <w:color w:val="4C4D4F"/>
+          <w:sz w:val="20"/>
+          <w:szCs w:val="20"/>
+          <w:lang w:bidi="fa-IR"/>
+        </w:rPr>
+        <w:t xml:space="preserve">, </w:t>
+      </w:r>
+      <w:r>
+        <w:rPr>
+          <w:rFonts w:asciiTheme="minorBidi" w:hAnsiTheme="minorBidi"/>
+          <w:color w:val="4C4D4F"/>
+          <w:sz w:val="20"/>
+          <w:szCs w:val="20"/>
+          <w:lang w:bidi="fa-IR"/>
+        </w:rPr>
+        <w:t>Onlinegnet</w:t>
+      </w:r>
+    </w:p>
+    <w:p>
+      <w:pPr>
+        <w:numPr>
+          <w:ilvl w:val="0"/>
+          <w:numId w:val="15"/>
+        </w:numPr>
+        <w:spacing w:after="0" w:line="240" w:lineRule="auto"/>
+        <w:rPr>
+          <w:rFonts w:asciiTheme="minorBidi" w:eastAsia="Times New Roman" w:hAnsiTheme="minorBidi"/>
+          <w:color w:val="404040" w:themeColor="text1" w:themeTint="BF"/>
+          <w:sz w:val="20"/>
+          <w:szCs w:val="20"/>
+        </w:rPr>
+      </w:pPr>
+      <w:r>
+        <w:rPr>
+          <w:rFonts w:asciiTheme="minorBidi" w:eastAsia="Times New Roman" w:hAnsiTheme="minorBidi"/>
+          <w:color w:val="404040" w:themeColor="text1" w:themeTint="BF"/>
+          <w:sz w:val="20"/>
+          <w:szCs w:val="20"/>
+        </w:rPr>
+        <w:t>Ad</w:t>
+      </w:r>
+      <w:r>
+        <w:rPr>
+          <w:rFonts w:asciiTheme="minorBidi" w:eastAsia="Times New Roman" w:hAnsiTheme="minorBidi"/>
+          <w:color w:val="404040" w:themeColor="text1" w:themeTint="BF"/>
+          <w:sz w:val="20"/>
+          <w:szCs w:val="20"/>
+        </w:rPr>
+        <w:t xml:space="preserve">ding a new feature called game </w:t>
+      </w:r>
+      <w:r>
+        <w:rPr>
+          <w:rFonts w:asciiTheme="minorBidi" w:eastAsia="Times New Roman" w:hAnsiTheme="minorBidi"/>
+          <w:color w:val="404040" w:themeColor="text1" w:themeTint="BF"/>
+          <w:sz w:val="20"/>
+          <w:szCs w:val="20"/>
+        </w:rPr>
+        <w:t>renting, which allow</w:t>
+      </w:r>
+      <w:r>
+        <w:rPr>
+          <w:rFonts w:asciiTheme="minorBidi" w:eastAsia="Times New Roman" w:hAnsiTheme="minorBidi"/>
+          <w:color w:val="404040" w:themeColor="text1" w:themeTint="BF"/>
+          <w:sz w:val="20"/>
+          <w:szCs w:val="20"/>
+        </w:rPr>
+        <w:t>s</w:t>
+      </w:r>
+      <w:r>
+        <w:rPr>
+          <w:rFonts w:asciiTheme="minorBidi" w:eastAsia="Times New Roman" w:hAnsiTheme="minorBidi"/>
+          <w:color w:val="404040" w:themeColor="text1" w:themeTint="BF"/>
+          <w:sz w:val="20"/>
+          <w:szCs w:val="20"/>
+        </w:rPr>
+        <w:t xml:space="preserve"> users to rent </w:t>
+      </w:r>
+      <w:r>
+        <w:rPr>
+          <w:rFonts w:asciiTheme="minorBidi" w:eastAsia="Times New Roman" w:hAnsiTheme="minorBidi"/>
+          <w:color w:val="404040" w:themeColor="text1" w:themeTint="BF"/>
+          <w:sz w:val="20"/>
+          <w:szCs w:val="20"/>
+        </w:rPr>
+        <w:t xml:space="preserve">a </w:t>
+      </w:r>
+      <w:r>
+        <w:rPr>
+          <w:rFonts w:asciiTheme="minorBidi" w:eastAsia="Times New Roman" w:hAnsiTheme="minorBidi"/>
+          <w:color w:val="404040" w:themeColor="text1" w:themeTint="BF"/>
+          <w:sz w:val="20"/>
+          <w:szCs w:val="20"/>
+        </w:rPr>
+        <w:t>game for a determined period</w:t>
+      </w:r>
+    </w:p>
+    <w:p>
+      <w:pPr>
+        <w:numPr>
+          <w:ilvl w:val="0"/>
+          <w:numId w:val="15"/>
+        </w:numPr>
+        <w:spacing w:after="0" w:line="240" w:lineRule="auto"/>
+        <w:rPr>
+          <w:rFonts w:asciiTheme="minorBidi" w:eastAsia="Times New Roman" w:hAnsiTheme="minorBidi"/>
+          <w:color w:val="404040" w:themeColor="text1" w:themeTint="BF"/>
+          <w:sz w:val="20"/>
+          <w:szCs w:val="20"/>
+        </w:rPr>
+      </w:pPr>
+      <w:r>
+        <w:rPr>
+          <w:rFonts w:asciiTheme="minorBidi" w:eastAsia="Times New Roman" w:hAnsiTheme="minorBidi"/>
+          <w:color w:val="404040" w:themeColor="text1" w:themeTint="BF"/>
+          <w:sz w:val="20"/>
+          <w:szCs w:val="20"/>
+        </w:rPr>
+        <w:t xml:space="preserve">Adding filter </w:t>
+      </w:r>
+      <w:r>
+        <w:rPr>
+          <w:rFonts w:asciiTheme="minorBidi" w:eastAsia="Times New Roman" w:hAnsiTheme="minorBidi"/>
+          <w:color w:val="404040" w:themeColor="text1" w:themeTint="BF"/>
+          <w:sz w:val="20"/>
+          <w:szCs w:val="20"/>
+        </w:rPr>
+        <w:t>ability to the search bar</w:t>
+      </w:r>
+    </w:p>
+    <w:p>
+      <w:pPr>
+        <w:numPr>
+          <w:ilvl w:val="0"/>
+          <w:numId w:val="15"/>
+        </w:numPr>
+        <w:spacing w:after="0" w:line="240" w:lineRule="auto"/>
+        <w:rPr>
+          <w:rFonts w:asciiTheme="minorBidi" w:eastAsia="Times New Roman" w:hAnsiTheme="minorBidi"/>
+          <w:color w:val="404040" w:themeColor="text1" w:themeTint="BF"/>
+          <w:sz w:val="20"/>
+          <w:szCs w:val="20"/>
+        </w:rPr>
+      </w:pPr>
+      <w:r>
+        <w:rPr>
+          <w:rFonts w:asciiTheme="minorBidi" w:eastAsia="Times New Roman" w:hAnsiTheme="minorBidi"/>
+          <w:color w:val="404040" w:themeColor="text1" w:themeTint="BF"/>
+          <w:sz w:val="20"/>
+          <w:szCs w:val="20"/>
+        </w:rPr>
+        <w:t xml:space="preserve">Adding </w:t>
+      </w:r>
+      <w:r>
+        <w:rPr>
+          <w:rFonts w:asciiTheme="minorBidi" w:eastAsia="Times New Roman" w:hAnsiTheme="minorBidi"/>
+          <w:color w:val="404040" w:themeColor="text1" w:themeTint="BF"/>
+          <w:sz w:val="20"/>
+          <w:szCs w:val="20"/>
+        </w:rPr>
+        <w:t xml:space="preserve">a </w:t>
+      </w:r>
+      <w:r>
+        <w:rPr>
+          <w:rFonts w:asciiTheme="minorBidi" w:eastAsia="Times New Roman" w:hAnsiTheme="minorBidi"/>
+          <w:color w:val="404040" w:themeColor="text1" w:themeTint="BF"/>
+          <w:sz w:val="20"/>
+          <w:szCs w:val="20"/>
+        </w:rPr>
+        <w:t xml:space="preserve">discount to prices, which could be </w:t>
+      </w:r>
+      <w:r>
+        <w:rPr>
+          <w:rFonts w:asciiTheme="minorBidi" w:eastAsia="Times New Roman" w:hAnsiTheme="minorBidi"/>
+          <w:color w:val="404040" w:themeColor="text1" w:themeTint="BF"/>
+          <w:sz w:val="20"/>
+          <w:szCs w:val="20"/>
+        </w:rPr>
+        <w:t xml:space="preserve">a </w:t>
+      </w:r>
+      <w:r>
+        <w:rPr>
+          <w:rFonts w:asciiTheme="minorBidi" w:eastAsia="Times New Roman" w:hAnsiTheme="minorBidi"/>
+          <w:color w:val="404040" w:themeColor="text1" w:themeTint="BF"/>
+          <w:sz w:val="20"/>
+          <w:szCs w:val="20"/>
+        </w:rPr>
+        <w:t xml:space="preserve">percentage </w:t>
+      </w:r>
+      <w:r>
+        <w:rPr>
+          <w:rFonts w:asciiTheme="minorBidi" w:eastAsia="Times New Roman" w:hAnsiTheme="minorBidi"/>
+          <w:color w:val="404040" w:themeColor="text1" w:themeTint="BF"/>
+          <w:sz w:val="20"/>
+          <w:szCs w:val="20"/>
+        </w:rPr>
+        <w:t xml:space="preserve">of the cost </w:t>
+      </w:r>
+      <w:r>
+        <w:rPr>
+          <w:rFonts w:asciiTheme="minorBidi" w:eastAsia="Times New Roman" w:hAnsiTheme="minorBidi"/>
+          <w:color w:val="404040" w:themeColor="text1" w:themeTint="BF"/>
+          <w:sz w:val="20"/>
+          <w:szCs w:val="20"/>
+        </w:rPr>
+        <w:t>or fixed</w:t>
       </w:r>
     </w:p>
     <w:p>
@@ -1934,7 +2179,6 @@
           <w:sz w:val="20"/>
           <w:szCs w:val="20"/>
         </w:rPr>
-        <w:lastRenderedPageBreak/>
         <w:t>Conduct</w:t>
       </w:r>
       <w:r>
@@ -2361,7 +2605,16 @@
           <w:sz w:val="20"/>
           <w:szCs w:val="20"/>
         </w:rPr>
-        <w:t>2020 - 2022</w:t>
+        <w:t>2017</w:t>
+      </w:r>
+      <w:r>
+        <w:rPr>
+          <w:rFonts w:asciiTheme="minorBidi" w:hAnsiTheme="minorBidi"/>
+          <w:color w:val="4C4D4F"/>
+          <w:sz w:val="20"/>
+          <w:szCs w:val="20"/>
+        </w:rPr>
+        <w:t xml:space="preserve"> - 2022</w:t>
       </w:r>
       <w:r>
         <w:rPr>
@@ -2411,28 +2664,6 @@
     </w:p>
     <w:p>
       <w:pPr>
-        <w:pStyle w:val="ListParagraph"/>
-        <w:spacing w:line="240" w:lineRule="auto"/>
-        <w:ind w:firstLine="720"/>
-        <w:rPr>
-          <w:rFonts w:asciiTheme="minorBidi" w:hAnsiTheme="minorBidi"/>
-          <w:color w:val="4C4D4F"/>
-          <w:sz w:val="20"/>
-          <w:szCs w:val="20"/>
-        </w:rPr>
-      </w:pPr>
-      <w:r>
-        <w:rPr>
-          <w:rFonts w:asciiTheme="minorBidi" w:hAnsiTheme="minorBidi"/>
-          <w:color w:val="4C4D4F"/>
-          <w:sz w:val="20"/>
-          <w:szCs w:val="20"/>
-        </w:rPr>
-        <w:t>Transfer Student</w:t>
-      </w:r>
-    </w:p>
-    <w:p>
-      <w:pPr>
         <w:spacing w:line="240" w:lineRule="auto"/>
         <w:ind w:left="720" w:firstLine="720"/>
         <w:rPr>
@@ -2473,349 +2704,6 @@
         </w:rPr>
         <w:t>Total GPA: 16.74/20=3.47/4</w:t>
       </w:r>
-    </w:p>
-    <w:p>
-      <w:pPr>
-        <w:spacing w:line="240" w:lineRule="auto"/>
-        <w:rPr>
-          <w:rFonts w:asciiTheme="minorBidi" w:hAnsiTheme="minorBidi"/>
-          <w:b/>
-          <w:bCs/>
-          <w:color w:val="4C4D4F"/>
-          <w:sz w:val="20"/>
-          <w:szCs w:val="20"/>
-        </w:rPr>
-      </w:pPr>
-      <w:r>
-        <w:rPr>
-          <w:rFonts w:asciiTheme="minorBidi" w:hAnsiTheme="minorBidi"/>
-          <w:color w:val="4C4D4F"/>
-          <w:sz w:val="20"/>
-          <w:szCs w:val="20"/>
-        </w:rPr>
-        <w:t>2017 - 2019</w:t>
-      </w:r>
-      <w:r>
-        <w:rPr>
-          <w:rFonts w:asciiTheme="minorBidi" w:hAnsiTheme="minorBidi"/>
-          <w:color w:val="4C4D4F"/>
-          <w:sz w:val="20"/>
-          <w:szCs w:val="20"/>
-        </w:rPr>
-        <w:tab/>
-      </w:r>
-      <w:r>
-        <w:rPr>
-          <w:rFonts w:asciiTheme="minorBidi" w:hAnsiTheme="minorBidi"/>
-          <w:b/>
-          <w:bCs/>
-          <w:color w:val="4C4D4F"/>
-          <w:sz w:val="20"/>
-          <w:szCs w:val="20"/>
-        </w:rPr>
-        <w:t>Bachelor of Computer Engineering</w:t>
-      </w:r>
-    </w:p>
-    <w:p>
-      <w:pPr>
-        <w:pStyle w:val="ListParagraph"/>
-        <w:spacing w:line="240" w:lineRule="auto"/>
-        <w:ind w:firstLine="720"/>
-        <w:rPr>
-          <w:rFonts w:asciiTheme="minorBidi" w:hAnsiTheme="minorBidi"/>
-          <w:color w:val="4C4D4F"/>
-          <w:sz w:val="20"/>
-          <w:szCs w:val="20"/>
-        </w:rPr>
-      </w:pPr>
-      <w:r>
-        <w:rPr>
-          <w:rFonts w:asciiTheme="minorBidi" w:hAnsiTheme="minorBidi"/>
-          <w:color w:val="4C4D4F"/>
-          <w:sz w:val="20"/>
-          <w:szCs w:val="20"/>
-        </w:rPr>
-        <w:t>Computer Engineering Department, University of Zanjan, Zanjan, Iran</w:t>
-      </w:r>
-    </w:p>
-    <w:p>
-      <w:pPr>
-        <w:spacing w:line="276" w:lineRule="auto"/>
-        <w:rPr>
-          <w:rFonts w:asciiTheme="minorBidi" w:hAnsiTheme="minorBidi"/>
-          <w:color w:val="4C4D4F"/>
-          <w:sz w:val="2"/>
-          <w:szCs w:val="2"/>
-        </w:rPr>
-      </w:pPr>
-    </w:p>
-    <w:p>
-      <w:pPr>
-        <w:rPr>
-          <w:rFonts w:asciiTheme="minorBidi" w:hAnsiTheme="minorBidi"/>
-          <w:b/>
-          <w:bCs/>
-          <w:color w:val="4B4C4E"/>
-          <w:sz w:val="24"/>
-          <w:szCs w:val="24"/>
-        </w:rPr>
-      </w:pPr>
-      <w:r>
-        <w:rPr>
-          <w:rFonts w:asciiTheme="minorBidi" w:hAnsiTheme="minorBidi"/>
-          <w:b/>
-          <w:bCs/>
-          <w:color w:val="4B4C4E"/>
-          <w:sz w:val="24"/>
-          <w:szCs w:val="24"/>
-        </w:rPr>
-        <w:t>PUBLICATIONS</w:t>
-      </w:r>
-    </w:p>
-    <w:p>
-      <w:pPr>
-        <w:rPr>
-          <w:rFonts w:asciiTheme="minorBidi" w:hAnsiTheme="minorBidi"/>
-          <w:b/>
-          <w:bCs/>
-          <w:color w:val="4B4C4E"/>
-          <w:sz w:val="20"/>
-          <w:szCs w:val="20"/>
-          <w:lang w:bidi="fa-IR"/>
-        </w:rPr>
-      </w:pPr>
-      <w:r>
-        <w:rPr>
-          <w:rFonts w:asciiTheme="minorBidi" w:hAnsiTheme="minorBidi"/>
-          <w:b/>
-          <w:bCs/>
-          <w:color w:val="4B4C4E"/>
-          <w:sz w:val="20"/>
-          <w:szCs w:val="20"/>
-          <w:lang w:bidi="fa-IR"/>
-        </w:rPr>
-        <w:t>Works in preparation</w:t>
-      </w:r>
-    </w:p>
-    <w:p>
-      <w:pPr>
-        <w:pStyle w:val="ListParagraph"/>
-        <w:numPr>
-          <w:ilvl w:val="0"/>
-          <w:numId w:val="13"/>
-        </w:numPr>
-        <w:rPr>
-          <w:rFonts w:asciiTheme="minorBidi" w:hAnsiTheme="minorBidi"/>
-          <w:b/>
-          <w:bCs/>
-          <w:color w:val="4B4C4E"/>
-          <w:sz w:val="20"/>
-          <w:szCs w:val="20"/>
-          <w:lang w:bidi="fa-IR"/>
-        </w:rPr>
-      </w:pPr>
-      <w:r>
-        <w:rPr>
-          <w:rFonts w:asciiTheme="minorBidi" w:hAnsiTheme="minorBidi"/>
-          <w:color w:val="4B4C4E"/>
-          <w:sz w:val="20"/>
-          <w:szCs w:val="20"/>
-          <w:lang w:bidi="fa-IR"/>
-        </w:rPr>
-        <w:t>OR Heidari</w:t>
-      </w:r>
-      <w:r>
-        <w:rPr>
-          <w:rFonts w:asciiTheme="minorBidi" w:hAnsiTheme="minorBidi"/>
-          <w:color w:val="4B4C4E"/>
-          <w:sz w:val="20"/>
-          <w:szCs w:val="20"/>
-          <w:lang w:bidi="fa-IR"/>
-        </w:rPr>
-        <w:t xml:space="preserve">, M Dadashi, </w:t>
-      </w:r>
-      <w:r>
-        <w:rPr>
-          <w:rFonts w:asciiTheme="minorBidi" w:hAnsiTheme="minorBidi"/>
-          <w:color w:val="4B4C4E"/>
-          <w:sz w:val="20"/>
-          <w:szCs w:val="20"/>
-          <w:lang w:bidi="fa-IR"/>
-        </w:rPr>
-        <w:t>M Maghbooli</w:t>
-      </w:r>
-      <w:r>
-        <w:rPr>
-          <w:rFonts w:asciiTheme="minorBidi" w:hAnsiTheme="minorBidi"/>
-          <w:color w:val="4B4C4E"/>
-          <w:sz w:val="20"/>
-          <w:szCs w:val="20"/>
-          <w:lang w:bidi="fa-IR"/>
-        </w:rPr>
-        <w:t>,</w:t>
-      </w:r>
-      <w:r>
-        <w:t xml:space="preserve"> </w:t>
-      </w:r>
-      <w:r>
-        <w:rPr>
-          <w:rFonts w:asciiTheme="minorBidi" w:hAnsiTheme="minorBidi"/>
-          <w:color w:val="4B4C4E"/>
-          <w:sz w:val="20"/>
-          <w:szCs w:val="20"/>
-          <w:lang w:bidi="fa-IR"/>
-        </w:rPr>
-        <w:t>M Soltani</w:t>
-      </w:r>
-      <w:r>
-        <w:rPr>
-          <w:rFonts w:asciiTheme="minorBidi" w:hAnsiTheme="minorBidi"/>
-          <w:color w:val="4B4C4E"/>
-          <w:sz w:val="20"/>
-          <w:szCs w:val="20"/>
-          <w:lang w:bidi="fa-IR"/>
-        </w:rPr>
-        <w:t xml:space="preserve">, A </w:t>
-      </w:r>
-      <w:r>
-        <w:rPr>
-          <w:rFonts w:asciiTheme="minorBidi" w:hAnsiTheme="minorBidi"/>
-          <w:color w:val="4B4C4E"/>
-          <w:sz w:val="20"/>
-          <w:szCs w:val="20"/>
-          <w:lang w:bidi="fa-IR"/>
-        </w:rPr>
-        <w:t>Zakerian Zadeh</w:t>
-      </w:r>
-      <w:r>
-        <w:rPr>
-          <w:rFonts w:asciiTheme="minorBidi" w:hAnsiTheme="minorBidi"/>
-          <w:color w:val="4B4C4E"/>
-          <w:sz w:val="20"/>
-          <w:szCs w:val="20"/>
-          <w:lang w:bidi="fa-IR"/>
-        </w:rPr>
-        <w:t xml:space="preserve">, </w:t>
-      </w:r>
-      <w:r>
-        <w:rPr>
-          <w:rFonts w:asciiTheme="minorBidi" w:hAnsiTheme="minorBidi"/>
-          <w:color w:val="4C4D4F"/>
-          <w:sz w:val="20"/>
-          <w:szCs w:val="20"/>
-        </w:rPr>
-        <w:t>“</w:t>
-      </w:r>
-      <w:r>
-        <w:rPr>
-          <w:rFonts w:asciiTheme="minorBidi" w:hAnsiTheme="minorBidi"/>
-          <w:color w:val="4C4D4F"/>
-          <w:sz w:val="20"/>
-          <w:szCs w:val="20"/>
-        </w:rPr>
-        <w:t>Assessment of structural connectivity and brain volumes after tDCS in stroke: a machine-learning method</w:t>
-      </w:r>
-      <w:r>
-        <w:rPr>
-          <w:rFonts w:asciiTheme="minorBidi" w:hAnsiTheme="minorBidi"/>
-          <w:color w:val="4C4D4F"/>
-          <w:sz w:val="20"/>
-          <w:szCs w:val="20"/>
-        </w:rPr>
-        <w:t>”</w:t>
-      </w:r>
-    </w:p>
-    <w:p>
-      <w:pPr>
-        <w:pStyle w:val="ListParagraph"/>
-        <w:numPr>
-          <w:ilvl w:val="0"/>
-          <w:numId w:val="13"/>
-        </w:numPr>
-        <w:rPr>
-          <w:rFonts w:asciiTheme="minorBidi" w:hAnsiTheme="minorBidi"/>
-          <w:b/>
-          <w:bCs/>
-          <w:color w:val="4B4C4E"/>
-          <w:sz w:val="20"/>
-          <w:szCs w:val="20"/>
-          <w:lang w:bidi="fa-IR"/>
-        </w:rPr>
-      </w:pPr>
-      <w:r>
-        <w:rPr>
-          <w:rFonts w:asciiTheme="minorBidi" w:hAnsiTheme="minorBidi"/>
-          <w:color w:val="4C4D4F"/>
-          <w:sz w:val="20"/>
-          <w:szCs w:val="20"/>
-        </w:rPr>
-        <w:t>OR Heidari, FN Yousefi,</w:t>
-      </w:r>
-      <w:r>
-        <w:rPr>
-          <w:rFonts w:asciiTheme="minorBidi" w:hAnsiTheme="minorBidi"/>
-          <w:color w:val="4C4D4F"/>
-          <w:sz w:val="20"/>
-          <w:szCs w:val="20"/>
-        </w:rPr>
-        <w:t xml:space="preserve"> MA Nitsche,</w:t>
-      </w:r>
-      <w:r>
-        <w:rPr>
-          <w:rFonts w:asciiTheme="minorBidi" w:hAnsiTheme="minorBidi"/>
-          <w:color w:val="4C4D4F"/>
-          <w:sz w:val="20"/>
-          <w:szCs w:val="20"/>
-        </w:rPr>
-        <w:t xml:space="preserve"> M Dadashi</w:t>
-      </w:r>
-      <w:r>
-        <w:rPr>
-          <w:rFonts w:asciiTheme="minorBidi" w:hAnsiTheme="minorBidi"/>
-          <w:color w:val="4C4D4F"/>
-          <w:sz w:val="20"/>
-          <w:szCs w:val="20"/>
-        </w:rPr>
-        <w:t>,</w:t>
-      </w:r>
-      <w:r>
-        <w:rPr>
-          <w:rFonts w:asciiTheme="minorBidi" w:hAnsiTheme="minorBidi"/>
-          <w:color w:val="4C4D4F"/>
-          <w:sz w:val="20"/>
-          <w:szCs w:val="20"/>
-        </w:rPr>
-        <w:t xml:space="preserve"> “</w:t>
-      </w:r>
-      <w:r>
-        <w:rPr>
-          <w:rFonts w:asciiTheme="minorBidi" w:hAnsiTheme="minorBidi"/>
-          <w:color w:val="4C4D4F"/>
-          <w:sz w:val="20"/>
-          <w:szCs w:val="20"/>
-        </w:rPr>
-        <w:t>Effectiveness of tDCS over the DLPFC on reducing clinical symptoms, improving working memory, and aberrant EEG functional connectivity in resting-state schizophrenia patients</w:t>
-      </w:r>
-      <w:r>
-        <w:rPr>
-          <w:rFonts w:asciiTheme="minorBidi" w:hAnsiTheme="minorBidi"/>
-          <w:color w:val="4C4D4F"/>
-          <w:sz w:val="20"/>
-          <w:szCs w:val="20"/>
-        </w:rPr>
-        <w:t>”</w:t>
-      </w:r>
-    </w:p>
-    <w:p>
-      <w:pPr>
-        <w:rPr>
-          <w:rFonts w:asciiTheme="minorBidi" w:hAnsiTheme="minorBidi"/>
-          <w:color w:val="4B4C4E"/>
-          <w:sz w:val="2"/>
-          <w:szCs w:val="2"/>
-          <w:lang w:bidi="fa-IR"/>
-        </w:rPr>
-      </w:pPr>
     </w:p>
     <w:p>
       <w:pPr>
@@ -3288,7 +3176,6 @@
           <w:szCs w:val="20"/>
           <w:lang w:bidi="fa-IR"/>
         </w:rPr>
-        <w:lastRenderedPageBreak/>
         <w:t>Coursera,</w:t>
       </w:r>
       <w:r>
@@ -3451,7 +3338,67 @@
           <w:szCs w:val="20"/>
           <w:lang w:bidi="fa-IR"/>
         </w:rPr>
-        <w:t>, M</w:t>
+        <w:t>,</w:t>
+      </w:r>
+      <w:r>
+        <w:rPr>
+          <w:rFonts w:asciiTheme="minorBidi" w:hAnsiTheme="minorBidi"/>
+          <w:color w:val="4C4D4F"/>
+          <w:sz w:val="20"/>
+          <w:szCs w:val="20"/>
+          <w:lang w:bidi="fa-IR"/>
+        </w:rPr>
+        <w:t xml:space="preserve"> </w:t>
+      </w:r>
+      <w:r>
+        <w:rPr>
+          <w:rFonts w:asciiTheme="minorBidi" w:hAnsiTheme="minorBidi"/>
+          <w:color w:val="4C4D4F"/>
+          <w:sz w:val="20"/>
+          <w:szCs w:val="20"/>
+          <w:lang w:bidi="fa-IR"/>
+        </w:rPr>
+        <w:t>PHP</w:t>
+      </w:r>
+      <w:r>
+        <w:rPr>
+          <w:rFonts w:asciiTheme="minorBidi" w:hAnsiTheme="minorBidi"/>
+          <w:color w:val="4C4D4F"/>
+          <w:sz w:val="20"/>
+          <w:szCs w:val="20"/>
+          <w:lang w:bidi="fa-IR"/>
+        </w:rPr>
+        <w:t xml:space="preserve">, </w:t>
+      </w:r>
+      <w:r>
+        <w:rPr>
+          <w:rFonts w:asciiTheme="minorBidi" w:hAnsiTheme="minorBidi"/>
+          <w:color w:val="4C4D4F"/>
+          <w:sz w:val="20"/>
+          <w:szCs w:val="20"/>
+          <w:lang w:bidi="fa-IR"/>
+        </w:rPr>
+        <w:t>JavaScript</w:t>
+      </w:r>
+      <w:r>
+        <w:rPr>
+          <w:rFonts w:asciiTheme="minorBidi" w:hAnsiTheme="minorBidi"/>
+          <w:color w:val="4C4D4F"/>
+          <w:sz w:val="20"/>
+          <w:szCs w:val="20"/>
+          <w:lang w:bidi="fa-IR"/>
+        </w:rPr>
+        <w:t xml:space="preserve">, </w:t>
+      </w:r>
+      <w:r>
+        <w:rPr>
+          <w:rFonts w:asciiTheme="minorBidi" w:hAnsiTheme="minorBidi"/>
+          <w:color w:val="4C4D4F"/>
+          <w:sz w:val="20"/>
+          <w:szCs w:val="20"/>
+          <w:lang w:bidi="fa-IR"/>
+        </w:rPr>
+        <w:t>M</w:t>
       </w:r>
       <w:r>
         <w:rPr>
@@ -3462,36 +3409,6 @@
           <w:lang w:bidi="fa-IR"/>
         </w:rPr>
         <w:t>ATLAB</w:t>
-      </w:r>
-      <w:r>
-        <w:rPr>
-          <w:rFonts w:asciiTheme="minorBidi" w:hAnsiTheme="minorBidi"/>
-          <w:color w:val="4C4D4F"/>
-          <w:sz w:val="20"/>
-          <w:szCs w:val="20"/>
-          <w:lang w:bidi="fa-IR"/>
-        </w:rPr>
-        <w:t>,</w:t>
-      </w:r>
-      <w:r>
-        <w:rPr>
-          <w:rFonts w:asciiTheme="minorBidi" w:hAnsiTheme="minorBidi"/>
-          <w:color w:val="4C4D4F"/>
-          <w:sz w:val="20"/>
-          <w:szCs w:val="20"/>
-          <w:lang w:bidi="fa-IR"/>
-        </w:rPr>
-        <w:t xml:space="preserve"> PHP, </w:t>
-      </w:r>
-      <w:r>
-        <w:rPr>
-          <w:rFonts w:asciiTheme="minorBidi" w:hAnsiTheme="minorBidi"/>
-          <w:color w:val="4C4D4F"/>
-          <w:sz w:val="20"/>
-          <w:szCs w:val="20"/>
-          <w:lang w:bidi="fa-IR"/>
-        </w:rPr>
-        <w:t>JavaScript</w:t>
       </w:r>
     </w:p>
     <w:p>
@@ -3522,7 +3439,31 @@
           <w:szCs w:val="20"/>
           <w:lang w:bidi="fa-IR"/>
         </w:rPr>
-        <w:t xml:space="preserve">Frameworks: </w:t>
+        <w:t>Frameworks</w:t>
+      </w:r>
+      <w:r>
+        <w:rPr>
+          <w:rFonts w:asciiTheme="minorBidi" w:hAnsiTheme="minorBidi"/>
+          <w:b/>
+          <w:bCs/>
+          <w:color w:val="4C4D4F"/>
+          <w:sz w:val="20"/>
+          <w:szCs w:val="20"/>
+          <w:lang w:bidi="fa-IR"/>
+        </w:rPr>
+        <w:t xml:space="preserve"> and Libraries</w:t>
+      </w:r>
+      <w:r>
+        <w:rPr>
+          <w:rFonts w:asciiTheme="minorBidi" w:hAnsiTheme="minorBidi"/>
+          <w:b/>
+          <w:bCs/>
+          <w:color w:val="4C4D4F"/>
+          <w:sz w:val="20"/>
+          <w:szCs w:val="20"/>
+          <w:lang w:bidi="fa-IR"/>
+        </w:rPr>
+        <w:t xml:space="preserve">: </w:t>
       </w:r>
       <w:r>
         <w:rPr>
@@ -3636,6 +3577,18 @@
           <w:szCs w:val="20"/>
           <w:lang w:bidi="fa-IR"/>
         </w:rPr>
+        <w:t xml:space="preserve">Relational </w:t>
+      </w:r>
+      <w:r>
+        <w:rPr>
+          <w:rFonts w:asciiTheme="minorBidi" w:hAnsiTheme="minorBidi"/>
+          <w:b/>
+          <w:bCs/>
+          <w:color w:val="4C4D4F"/>
+          <w:sz w:val="20"/>
+          <w:szCs w:val="20"/>
+          <w:lang w:bidi="fa-IR"/>
+        </w:rPr>
         <w:t xml:space="preserve">Databases: </w:t>
       </w:r>
       <w:r>
@@ -3648,35 +3601,58 @@
         </w:rPr>
         <w:t>MySQL, PostgreSQL</w:t>
       </w:r>
-      <w:r>
-        <w:rPr>
-          <w:rFonts w:asciiTheme="minorBidi" w:hAnsiTheme="minorBidi"/>
-          <w:color w:val="4C4D4F"/>
-          <w:sz w:val="20"/>
-          <w:szCs w:val="20"/>
-          <w:lang w:bidi="fa-IR"/>
-        </w:rPr>
-        <w:t>, Redis</w:t>
-      </w:r>
-      <w:r>
-        <w:rPr>
-          <w:rFonts w:asciiTheme="minorBidi" w:hAnsiTheme="minorBidi"/>
-          <w:color w:val="4C4D4F"/>
-          <w:sz w:val="20"/>
-          <w:szCs w:val="20"/>
-          <w:lang w:bidi="fa-IR"/>
-        </w:rPr>
-        <w:t>, MongoDB</w:t>
-      </w:r>
-    </w:p>
-    <w:p>
-      <w:pPr>
+    </w:p>
+    <w:p>
+      <w:pPr>
+        <w:pStyle w:val="ListParagraph"/>
+        <w:numPr>
+          <w:ilvl w:val="0"/>
+          <w:numId w:val="1"/>
+        </w:numPr>
         <w:tabs>
-          <w:tab w:val="left" w:pos="3253"/>
+          <w:tab w:val="left" w:pos="1996"/>
         </w:tabs>
-        <w:spacing w:line="276" w:lineRule="auto"/>
-        <w:rPr>
-          <w:rFonts w:asciiTheme="minorBidi" w:hAnsiTheme="minorBidi"/>
+        <w:rPr>
+          <w:rFonts w:asciiTheme="minorBidi" w:hAnsiTheme="minorBidi"/>
+          <w:b/>
+          <w:bCs/>
+          <w:color w:val="404040" w:themeColor="text1" w:themeTint="BF"/>
+          <w:sz w:val="20"/>
+          <w:szCs w:val="20"/>
+          <w:lang w:bidi="fa-IR"/>
+        </w:rPr>
+      </w:pPr>
+      <w:r>
+        <w:rPr>
+          <w:rFonts w:asciiTheme="minorBidi" w:hAnsiTheme="minorBidi"/>
+          <w:b/>
+          <w:bCs/>
+          <w:color w:val="404040" w:themeColor="text1" w:themeTint="BF"/>
+          <w:sz w:val="20"/>
+          <w:szCs w:val="20"/>
+          <w:lang w:bidi="fa-IR"/>
+        </w:rPr>
+        <w:t xml:space="preserve">NoSQL Databases: </w:t>
+      </w:r>
+      <w:r>
+        <w:rPr>
+          <w:rFonts w:asciiTheme="minorBidi" w:hAnsiTheme="minorBidi"/>
+          <w:color w:val="4C4D4F"/>
+          <w:sz w:val="20"/>
+          <w:szCs w:val="20"/>
+          <w:lang w:bidi="fa-IR"/>
+        </w:rPr>
+        <w:t>Redis, MongoDB</w:t>
+      </w:r>
+    </w:p>
+    <w:p>
+      <w:pPr>
+        <w:tabs>
+          <w:tab w:val="left" w:pos="1996"/>
+        </w:tabs>
+        <w:rPr>
+          <w:rFonts w:asciiTheme="minorBidi" w:hAnsiTheme="minorBidi"/>
+          <w:color w:val="404040" w:themeColor="text1" w:themeTint="BF"/>
           <w:sz w:val="2"/>
           <w:szCs w:val="2"/>
           <w:lang w:bidi="fa-IR"/>
@@ -3741,19 +3717,8 @@
           <w:szCs w:val="20"/>
           <w:lang w:bidi="fa-IR"/>
         </w:rPr>
-        <w:t>Persian</w:t>
-      </w:r>
-      <w:r>
-        <w:rPr>
-          <w:rFonts w:asciiTheme="minorBidi" w:hAnsiTheme="minorBidi"/>
-          <w:b/>
-          <w:bCs/>
-          <w:color w:val="4C4D4F"/>
-          <w:sz w:val="20"/>
-          <w:szCs w:val="20"/>
-          <w:lang w:bidi="fa-IR"/>
-        </w:rPr>
-        <w:t xml:space="preserve">: </w:t>
+        <w:lastRenderedPageBreak/>
+        <w:t xml:space="preserve">Persian: </w:t>
       </w:r>
       <w:r>
         <w:rPr>
@@ -3795,7 +3760,17 @@
           <w:szCs w:val="20"/>
           <w:lang w:bidi="fa-IR"/>
         </w:rPr>
-        <w:t>English</w:t>
+        <w:t xml:space="preserve">English: </w:t>
+      </w:r>
+      <w:r>
+        <w:rPr>
+          <w:rFonts w:asciiTheme="minorBidi" w:hAnsiTheme="minorBidi"/>
+          <w:color w:val="4C4D4F"/>
+          <w:sz w:val="20"/>
+          <w:szCs w:val="20"/>
+          <w:lang w:bidi="fa-IR"/>
+        </w:rPr>
+        <w:t>IELTS</w:t>
       </w:r>
       <w:r>
         <w:rPr>
@@ -3807,18 +3782,6 @@
           <w:szCs w:val="20"/>
           <w:lang w:bidi="fa-IR"/>
         </w:rPr>
-        <w:t>:</w:t>
-      </w:r>
-      <w:r>
-        <w:rPr>
-          <w:rFonts w:asciiTheme="minorBidi" w:hAnsiTheme="minorBidi"/>
-          <w:b/>
-          <w:bCs/>
-          <w:color w:val="4C4D4F"/>
-          <w:sz w:val="20"/>
-          <w:szCs w:val="20"/>
-          <w:lang w:bidi="fa-IR"/>
-        </w:rPr>
         <w:t xml:space="preserve"> </w:t>
       </w:r>
       <w:r>
@@ -3829,50 +3792,22 @@
           <w:szCs w:val="20"/>
           <w:lang w:bidi="fa-IR"/>
         </w:rPr>
-        <w:t>IELTS</w:t>
-      </w:r>
-      <w:r>
-        <w:rPr>
-          <w:rFonts w:asciiTheme="minorBidi" w:hAnsiTheme="minorBidi"/>
-          <w:b/>
-          <w:bCs/>
-          <w:color w:val="4C4D4F"/>
-          <w:sz w:val="20"/>
-          <w:szCs w:val="20"/>
-          <w:lang w:bidi="fa-IR"/>
-        </w:rPr>
-        <w:t xml:space="preserve"> </w:t>
-      </w:r>
-      <w:r>
-        <w:rPr>
-          <w:rFonts w:asciiTheme="minorBidi" w:hAnsiTheme="minorBidi"/>
-          <w:color w:val="4C4D4F"/>
-          <w:sz w:val="20"/>
-          <w:szCs w:val="20"/>
-          <w:lang w:bidi="fa-IR"/>
-        </w:rPr>
-        <w:t xml:space="preserve">Academic </w:t>
-      </w:r>
-      <w:r>
-        <w:rPr>
-          <w:rFonts w:asciiTheme="minorBidi" w:hAnsiTheme="minorBidi"/>
-          <w:color w:val="4C4D4F"/>
-          <w:sz w:val="20"/>
-          <w:szCs w:val="20"/>
-          <w:lang w:bidi="fa-IR"/>
-        </w:rPr>
-        <w:t>7</w:t>
-      </w:r>
-      <w:r>
-        <w:rPr>
-          <w:rFonts w:asciiTheme="minorBidi" w:hAnsiTheme="minorBidi"/>
-          <w:color w:val="4C4D4F"/>
-          <w:sz w:val="20"/>
-          <w:szCs w:val="20"/>
-          <w:lang w:bidi="fa-IR"/>
-        </w:rPr>
-        <w:t xml:space="preserve"> (L:7.5, R:7, W:6, S:6.5)</w:t>
-      </w:r>
+        <w:t>Academic 7 (L:7.5, R:7, W:6, S:6.5)</w:t>
+      </w:r>
+    </w:p>
+    <w:p>
+      <w:pPr>
+        <w:tabs>
+          <w:tab w:val="left" w:pos="1996"/>
+        </w:tabs>
+        <w:rPr>
+          <w:rFonts w:asciiTheme="minorBidi" w:hAnsiTheme="minorBidi"/>
+          <w:color w:val="404040" w:themeColor="text1" w:themeTint="BF"/>
+          <w:sz w:val="2"/>
+          <w:szCs w:val="2"/>
+          <w:lang w:bidi="fa-IR"/>
+        </w:rPr>
+      </w:pPr>
     </w:p>
     <w:sectPr>
       <w:headerReference w:type="even" r:id="rId22"/>
@@ -4037,7 +3972,17 @@
             <w:sz w:val="20"/>
             <w:szCs w:val="20"/>
           </w:rPr>
-          <w:t xml:space="preserve"> of 3</w:t>
+          <w:t xml:space="preserve"> of </w:t>
+        </w:r>
+        <w:r>
+          <w:rPr>
+            <w:rFonts w:asciiTheme="minorBidi" w:hAnsiTheme="minorBidi"/>
+            <w:noProof/>
+            <w:color w:val="4C4D4F"/>
+            <w:sz w:val="20"/>
+            <w:szCs w:val="20"/>
+          </w:rPr>
+          <w:t>3</w:t>
         </w:r>
       </w:p>
     </w:sdtContent>
@@ -4572,6 +4517,155 @@
     </w:lvl>
   </w:abstractNum>
   <w:abstractNum w:abstractNumId="4" w15:restartNumberingAfterBreak="0">
+    <w:nsid w:val="20133BB1"/>
+    <w:multiLevelType w:val="multilevel"/>
+    <w:tmpl w:val="4FC0FBE0"/>
+    <w:lvl w:ilvl="0">
+      <w:start w:val="1"/>
+      <w:numFmt w:val="bullet"/>
+      <w:lvlText w:val=""/>
+      <w:lvlJc w:val="left"/>
+      <w:pPr>
+        <w:tabs>
+          <w:tab w:val="num" w:pos="720"/>
+        </w:tabs>
+        <w:ind w:left="720" w:hanging="360"/>
+      </w:pPr>
+      <w:rPr>
+        <w:rFonts w:ascii="Symbol" w:hAnsi="Symbol" w:hint="default"/>
+        <w:sz w:val="20"/>
+      </w:rPr>
+    </w:lvl>
+    <w:lvl w:ilvl="1" w:tentative="1">
+      <w:start w:val="1"/>
+      <w:numFmt w:val="bullet"/>
+      <w:lvlText w:val="o"/>
+      <w:lvlJc w:val="left"/>
+      <w:pPr>
+        <w:tabs>
+          <w:tab w:val="num" w:pos="1440"/>
+        </w:tabs>
+        <w:ind w:left="1440" w:hanging="360"/>
+      </w:pPr>
+      <w:rPr>
+        <w:rFonts w:ascii="Courier New" w:hAnsi="Courier New" w:hint="default"/>
+        <w:sz w:val="20"/>
+      </w:rPr>
+    </w:lvl>
+    <w:lvl w:ilvl="2" w:tentative="1">
+      <w:start w:val="1"/>
+      <w:numFmt w:val="bullet"/>
+      <w:lvlText w:val=""/>
+      <w:lvlJc w:val="left"/>
+      <w:pPr>
+        <w:tabs>
+          <w:tab w:val="num" w:pos="2160"/>
+        </w:tabs>
+        <w:ind w:left="2160" w:hanging="360"/>
+      </w:pPr>
+      <w:rPr>
+        <w:rFonts w:ascii="Wingdings" w:hAnsi="Wingdings" w:hint="default"/>
+        <w:sz w:val="20"/>
+      </w:rPr>
+    </w:lvl>
+    <w:lvl w:ilvl="3" w:tentative="1">
+      <w:start w:val="1"/>
+      <w:numFmt w:val="bullet"/>
+      <w:lvlText w:val=""/>
+      <w:lvlJc w:val="left"/>
+      <w:pPr>
+        <w:tabs>
+          <w:tab w:val="num" w:pos="2880"/>
+        </w:tabs>
+        <w:ind w:left="2880" w:hanging="360"/>
+      </w:pPr>
+      <w:rPr>
+        <w:rFonts w:ascii="Wingdings" w:hAnsi="Wingdings" w:hint="default"/>
+        <w:sz w:val="20"/>
+      </w:rPr>
+    </w:lvl>
+    <w:lvl w:ilvl="4" w:tentative="1">
+      <w:start w:val="1"/>
+      <w:numFmt w:val="bullet"/>
+      <w:lvlText w:val=""/>
+      <w:lvlJc w:val="left"/>
+      <w:pPr>
+        <w:tabs>
+          <w:tab w:val="num" w:pos="3600"/>
+        </w:tabs>
+        <w:ind w:left="3600" w:hanging="360"/>
+      </w:pPr>
+      <w:rPr>
+        <w:rFonts w:ascii="Wingdings" w:hAnsi="Wingdings" w:hint="default"/>
+        <w:sz w:val="20"/>
+      </w:rPr>
+    </w:lvl>
+    <w:lvl w:ilvl="5" w:tentative="1">
+      <w:start w:val="1"/>
+      <w:numFmt w:val="bullet"/>
+      <w:lvlText w:val=""/>
+      <w:lvlJc w:val="left"/>
+      <w:pPr>
+        <w:tabs>
+          <w:tab w:val="num" w:pos="4320"/>
+        </w:tabs>
+        <w:ind w:left="4320" w:hanging="360"/>
+      </w:pPr>
+      <w:rPr>
+        <w:rFonts w:ascii="Wingdings" w:hAnsi="Wingdings" w:hint="default"/>
+        <w:sz w:val="20"/>
+      </w:rPr>
+    </w:lvl>
+    <w:lvl w:ilvl="6" w:tentative="1">
+      <w:start w:val="1"/>
+      <w:numFmt w:val="bullet"/>
+      <w:lvlText w:val=""/>
+      <w:lvlJc w:val="left"/>
+      <w:pPr>
+        <w:tabs>
+          <w:tab w:val="num" w:pos="5040"/>
+        </w:tabs>
+        <w:ind w:left="5040" w:hanging="360"/>
+      </w:pPr>
+      <w:rPr>
+        <w:rFonts w:ascii="Wingdings" w:hAnsi="Wingdings" w:hint="default"/>
+        <w:sz w:val="20"/>
+      </w:rPr>
+    </w:lvl>
+    <w:lvl w:ilvl="7" w:tentative="1">
+      <w:start w:val="1"/>
+      <w:numFmt w:val="bullet"/>
+      <w:lvlText w:val=""/>
+      <w:lvlJc w:val="left"/>
+      <w:pPr>
+        <w:tabs>
+          <w:tab w:val="num" w:pos="5760"/>
+        </w:tabs>
+        <w:ind w:left="5760" w:hanging="360"/>
+      </w:pPr>
+      <w:rPr>
+        <w:rFonts w:ascii="Wingdings" w:hAnsi="Wingdings" w:hint="default"/>
+        <w:sz w:val="20"/>
+      </w:rPr>
+    </w:lvl>
+    <w:lvl w:ilvl="8" w:tentative="1">
+      <w:start w:val="1"/>
+      <w:numFmt w:val="bullet"/>
+      <w:lvlText w:val=""/>
+      <w:lvlJc w:val="left"/>
+      <w:pPr>
+        <w:tabs>
+          <w:tab w:val="num" w:pos="6480"/>
+        </w:tabs>
+        <w:ind w:left="6480" w:hanging="360"/>
+      </w:pPr>
+      <w:rPr>
+        <w:rFonts w:ascii="Wingdings" w:hAnsi="Wingdings" w:hint="default"/>
+        <w:sz w:val="20"/>
+      </w:rPr>
+    </w:lvl>
+  </w:abstractNum>
+  <w:abstractNum w:abstractNumId="5" w15:restartNumberingAfterBreak="0">
     <w:nsid w:val="299B612C"/>
     <w:multiLevelType w:val="hybridMultilevel"/>
     <w:tmpl w:val="4B602B2C"/>
@@ -4684,7 +4778,7 @@
       </w:rPr>
     </w:lvl>
   </w:abstractNum>
-  <w:abstractNum w:abstractNumId="5" w15:restartNumberingAfterBreak="0">
+  <w:abstractNum w:abstractNumId="6" w15:restartNumberingAfterBreak="0">
     <w:nsid w:val="34090B0B"/>
     <w:multiLevelType w:val="hybridMultilevel"/>
     <w:tmpl w:val="AFD02D72"/>
@@ -4797,7 +4891,7 @@
       </w:rPr>
     </w:lvl>
   </w:abstractNum>
-  <w:abstractNum w:abstractNumId="6" w15:restartNumberingAfterBreak="0">
+  <w:abstractNum w:abstractNumId="7" w15:restartNumberingAfterBreak="0">
     <w:nsid w:val="44787CD2"/>
     <w:multiLevelType w:val="hybridMultilevel"/>
     <w:tmpl w:val="C83EAD9A"/>
@@ -4910,7 +5004,7 @@
       </w:rPr>
     </w:lvl>
   </w:abstractNum>
-  <w:abstractNum w:abstractNumId="7" w15:restartNumberingAfterBreak="0">
+  <w:abstractNum w:abstractNumId="8" w15:restartNumberingAfterBreak="0">
     <w:nsid w:val="4695169C"/>
     <w:multiLevelType w:val="hybridMultilevel"/>
     <w:tmpl w:val="1A1E70E0"/>
@@ -5023,7 +5117,7 @@
       </w:rPr>
     </w:lvl>
   </w:abstractNum>
-  <w:abstractNum w:abstractNumId="8" w15:restartNumberingAfterBreak="0">
+  <w:abstractNum w:abstractNumId="9" w15:restartNumberingAfterBreak="0">
     <w:nsid w:val="63E4684D"/>
     <w:multiLevelType w:val="hybridMultilevel"/>
     <w:tmpl w:val="DA266A96"/>
@@ -5109,7 +5203,7 @@
       </w:pPr>
     </w:lvl>
   </w:abstractNum>
-  <w:abstractNum w:abstractNumId="9" w15:restartNumberingAfterBreak="0">
+  <w:abstractNum w:abstractNumId="10" w15:restartNumberingAfterBreak="0">
     <w:nsid w:val="6A98188D"/>
     <w:multiLevelType w:val="hybridMultilevel"/>
     <w:tmpl w:val="FD7AF12C"/>
@@ -5222,7 +5316,7 @@
       </w:rPr>
     </w:lvl>
   </w:abstractNum>
-  <w:abstractNum w:abstractNumId="10" w15:restartNumberingAfterBreak="0">
+  <w:abstractNum w:abstractNumId="11" w15:restartNumberingAfterBreak="0">
     <w:nsid w:val="6DC55C6F"/>
     <w:multiLevelType w:val="hybridMultilevel"/>
     <w:tmpl w:val="9114288A"/>
@@ -5335,7 +5429,7 @@
       </w:rPr>
     </w:lvl>
   </w:abstractNum>
-  <w:abstractNum w:abstractNumId="11" w15:restartNumberingAfterBreak="0">
+  <w:abstractNum w:abstractNumId="12" w15:restartNumberingAfterBreak="0">
     <w:nsid w:val="6F2B0389"/>
     <w:multiLevelType w:val="hybridMultilevel"/>
     <w:tmpl w:val="502E43C2"/>
@@ -5448,7 +5542,7 @@
       </w:rPr>
     </w:lvl>
   </w:abstractNum>
-  <w:abstractNum w:abstractNumId="12" w15:restartNumberingAfterBreak="0">
+  <w:abstractNum w:abstractNumId="13" w15:restartNumberingAfterBreak="0">
     <w:nsid w:val="75E51B3A"/>
     <w:multiLevelType w:val="hybridMultilevel"/>
     <w:tmpl w:val="7674A95E"/>
@@ -5561,7 +5655,7 @@
       </w:rPr>
     </w:lvl>
   </w:abstractNum>
-  <w:abstractNum w:abstractNumId="13" w15:restartNumberingAfterBreak="0">
+  <w:abstractNum w:abstractNumId="14" w15:restartNumberingAfterBreak="0">
     <w:nsid w:val="76EC1729"/>
     <w:multiLevelType w:val="hybridMultilevel"/>
     <w:tmpl w:val="486A5722"/>
@@ -5681,10 +5775,10 @@
     <w:abstractNumId w:val="2"/>
   </w:num>
   <w:num w:numId="3" w16cid:durableId="1372683249">
-    <w:abstractNumId w:val="9"/>
+    <w:abstractNumId w:val="10"/>
   </w:num>
   <w:num w:numId="4" w16cid:durableId="1218515743">
-    <w:abstractNumId w:val="13"/>
+    <w:abstractNumId w:val="14"/>
   </w:num>
   <w:num w:numId="5" w16cid:durableId="813181568">
     <w:abstractNumId w:val="0"/>
@@ -5693,28 +5787,31 @@
     <w:abstractNumId w:val="3"/>
   </w:num>
   <w:num w:numId="7" w16cid:durableId="972095975">
+    <w:abstractNumId w:val="9"/>
+  </w:num>
+  <w:num w:numId="8" w16cid:durableId="2097549485">
+    <w:abstractNumId w:val="11"/>
+  </w:num>
+  <w:num w:numId="9" w16cid:durableId="1232547508">
+    <w:abstractNumId w:val="5"/>
+  </w:num>
+  <w:num w:numId="10" w16cid:durableId="807741970">
+    <w:abstractNumId w:val="12"/>
+  </w:num>
+  <w:num w:numId="11" w16cid:durableId="1251281186">
+    <w:abstractNumId w:val="6"/>
+  </w:num>
+  <w:num w:numId="12" w16cid:durableId="1717239822">
     <w:abstractNumId w:val="8"/>
   </w:num>
-  <w:num w:numId="8" w16cid:durableId="2097549485">
-    <w:abstractNumId w:val="10"/>
+  <w:num w:numId="13" w16cid:durableId="356808474">
+    <w:abstractNumId w:val="13"/>
   </w:num>
-  <w:num w:numId="9" w16cid:durableId="1232547508">
-    <w:abstractNumId w:val="4"/>
-  </w:num>
-  <w:num w:numId="10" w16cid:durableId="807741970">
-    <w:abstractNumId w:val="11"/>
-  </w:num>
-  <w:num w:numId="11" w16cid:durableId="1251281186">
-    <w:abstractNumId w:val="5"/>
-  </w:num>
-  <w:num w:numId="12" w16cid:durableId="1717239822">
+  <w:num w:numId="14" w16cid:durableId="569312527">
     <w:abstractNumId w:val="7"/>
   </w:num>
-  <w:num w:numId="13" w16cid:durableId="356808474">
-    <w:abstractNumId w:val="12"/>
-  </w:num>
-  <w:num w:numId="14" w16cid:durableId="569312527">
-    <w:abstractNumId w:val="6"/>
+  <w:num w:numId="15" w16cid:durableId="987897887">
+    <w:abstractNumId w:val="4"/>
   </w:num>
 </w:numbering>
 </file>

</xml_diff>